<commit_message>
added cs451 project and updated skills
</commit_message>
<xml_diff>
--- a/public/ResumeMalachiRosarioDs.docx
+++ b/public/ResumeMalachiRosarioDs.docx
@@ -266,25 +266,7 @@
         <w:rPr>
           <w:rFonts w:ascii="Times New Roman" w:hAnsi="Times New Roman" w:cs="Times New Roman"/>
         </w:rPr>
-        <w:tab/>
-      </w:r>
-      <w:r>
-        <w:rPr>
-          <w:rFonts w:ascii="Times New Roman" w:hAnsi="Times New Roman" w:cs="Times New Roman"/>
-        </w:rPr>
-        <w:t xml:space="preserve">Expected Graduation </w:t>
-      </w:r>
-      <w:r>
-        <w:rPr>
-          <w:rFonts w:ascii="Times New Roman" w:hAnsi="Times New Roman" w:cs="Times New Roman"/>
-        </w:rPr>
-        <w:t>05/</w:t>
-      </w:r>
-      <w:r>
-        <w:rPr>
-          <w:rFonts w:ascii="Times New Roman" w:hAnsi="Times New Roman" w:cs="Times New Roman"/>
-        </w:rPr>
-        <w:t>2026</w:t>
+        <w:t xml:space="preserve"> </w:t>
       </w:r>
     </w:p>
     <w:p>
@@ -371,7 +353,19 @@
         <w:rPr>
           <w:rFonts w:ascii="Times New Roman" w:hAnsi="Times New Roman" w:cs="Times New Roman"/>
         </w:rPr>
-        <w:t xml:space="preserve"> Probability and Statistics | Linear Algebra | Object-Oriented Programming I, II </w:t>
+        <w:t xml:space="preserve"> Probability and Statistics | Linear Algebra | Object-Oriented Programming I, II</w:t>
+      </w:r>
+      <w:r>
+        <w:rPr>
+          <w:rFonts w:ascii="Times New Roman" w:hAnsi="Times New Roman" w:cs="Times New Roman"/>
+        </w:rPr>
+        <w:t xml:space="preserve"> </w:t>
+      </w:r>
+      <w:r>
+        <w:rPr>
+          <w:rFonts w:ascii="Times New Roman" w:hAnsi="Times New Roman" w:cs="Times New Roman"/>
+        </w:rPr>
+        <w:t>| Graph Theory</w:t>
       </w:r>
     </w:p>
     <w:p>

</xml_diff>